<commit_message>
online essay: add paragraph on nuclear-test victims beyond Hiroshima/Nagasaki
Co-Authored-By: Tatsuki Onishi <bougtoir@gmail.com>
</commit_message>
<xml_diff>
--- a/calculus_of_lives/output/online_essay_en.docx
+++ b/calculus_of_lives/output/online_essay_en.docx
@@ -91,6 +91,11 @@
         <w:t>3</w:t>
       </w:r>
       <w:r/>
+    </w:p>
+    <w:p>
+      <w:r>
+        <w:t>A related blindness deserves naming here. It is often said that Japan is the world’s only atomic-bombed nation. In the narrow sense—the only country attacked with nuclear weapons in war—that is true, and I say it as a Japanese writer who has no wish to trade on national grievance. But if we judge by what was actually done to human bodies, rather than by the grammar of war, the atomic age has far more victims than Hiroshima and Nagasaki: the Marshall Islanders exposed by the Castle Bravo test, the Kazakhs downwind of Semipalatinsk, Aboriginal Australians at Maralinga, Algerians in the French Sahara, Polynesians at Moruroa, and the downwinders of New Mexico and Nevada. Most of them were colonized, indigenous, or otherwise without political standing—the very people a calculus in the taking way can treat as an empty margin. That they are so seldom counted among “the bombed” is itself an instance of the argument I am making: whose death gets named depends on who was granted a place on the scale to begin with.</w:t>
+      </w:r>
     </w:p>
     <w:p>
       <w:r>

</xml_diff>